<commit_message>
Reframe brief: peer-exchange questions + policy (energy/utilities/health) positioning
Rework the Maria Basso conversation brief on two axes of feedback:
- Questions (§7) rebuilt as a peer exchange that connects her work to the
  candidate's — each opens with the candidate's own view or experience, then
  invites hers — instead of reading like an interview of her.
- Positioning (§5, §8, §0) rebuilt around a policy background in
  climate-resilient energy, utilities and health: policy and the enabling
  environment as the scarce asset for scaling AI in regulated, public-interest
  sectors, framed as an extension of the AI-First "systems-design" thesis.
Cheat sheet updated to match; qa() builder gains a configurable trailing label.

Co-Authored-By: Claude Opus 4.8 <noreply@anthropic.com>
Claude-Session: https://claude.ai/code/session_01EZxBFkBWeDJwcdSQ6Bw58r
</commit_message>
<xml_diff>
--- a/Maria_Basso_Cheat_Sheet.docx
+++ b/Maria_Basso_Cheat_Sheet.docx
@@ -82,7 +82,7 @@
                 <w:sz w:val="20"/>
                 <w:szCs w:val="20"/>
               </w:rPr>
-              <w:t xml:space="preserve">I come from [energy / manufacturing / industrial-tech], where I [built / scaled / ran] [X] — so I’ve spent my career where technology meets the real, physical economy. That’s exactly where AI most needs to prove itself and has the fewest natural translators. I’m not here to be another AI specialist; making AI work in energy and industry is a systems problem, and that’s the problem I know.</w:t>
+              <w:t xml:space="preserve">I work the policy and enabling-environment side of climate-resilient energy, utilities and health — the regulated, public-interest sectors where AI is genuinely hard to deploy. That’s where your MINDS proof and the AI-First pattern most need to hold, and where the bottleneck is as much policy and market design as technology. I’m not here as an AI specialist — I’m here because I know why AI scales or stalls in exactly the sectors you’re trying to transform.</w:t>
             </w:r>
           </w:p>
         </w:tc>
@@ -1090,77 +1090,37 @@
           <w:sz w:val="22"/>
           <w:szCs w:val="22"/>
         </w:rPr>
-        <w:t xml:space="preserve">Your turf — AI × Energy and AI × Industry</w:t>
-      </w:r>
-    </w:p>
-    <w:p>
-      <w:pPr>
-        <w:pStyle w:val="ListParagraph"/>
-        <w:numPr>
-          <w:ilvl w:val="0"/>
-          <w:numId w:val="1"/>
-        </w:numPr>
-        <w:spacing w:after="70" w:line="268"/>
-      </w:pPr>
-      <w:r>
-        <w:rPr>
-          <w:rFonts w:ascii="Georgia" w:cs="Georgia" w:eastAsia="Georgia" w:hAnsi="Georgia"/>
-          <w:b/>
-          <w:bCs/>
-          <w:color w:val="1A1A1A"/>
-          <w:sz w:val="21"/>
-          <w:szCs w:val="21"/>
-        </w:rPr>
-        <w:t xml:space="preserve">AI’s energy dilemma</w:t>
-      </w:r>
-      <w:r>
-        <w:rPr>
-          <w:rFonts w:ascii="Georgia" w:cs="Georgia" w:eastAsia="Georgia" w:hAnsi="Georgia"/>
-          <w:color w:val="1A1A1A"/>
-          <w:sz w:val="21"/>
-          <w:szCs w:val="21"/>
-        </w:rPr>
-        <w:t xml:space="preserve"> (her Jan-2025 article): data centres ~</w:t>
-      </w:r>
-      <w:r>
-        <w:rPr>
-          <w:rFonts w:ascii="Georgia" w:cs="Georgia" w:eastAsia="Georgia" w:hAnsi="Georgia"/>
-          <w:b/>
-          <w:bCs/>
-          <w:color w:val="1A1A1A"/>
-          <w:sz w:val="21"/>
-          <w:szCs w:val="21"/>
-        </w:rPr>
-        <w:t xml:space="preserve">415→945 TWh by 2030</w:t>
-      </w:r>
-      <w:r>
-        <w:rPr>
-          <w:rFonts w:ascii="Georgia" w:cs="Georgia" w:eastAsia="Georgia" w:hAnsi="Georgia"/>
-          <w:color w:val="1A1A1A"/>
-          <w:sz w:val="21"/>
-          <w:szCs w:val="21"/>
-        </w:rPr>
-        <w:t xml:space="preserve"> (1%→3%+ of electricity); AI power use up to </w:t>
-      </w:r>
-      <w:r>
-        <w:rPr>
-          <w:rFonts w:ascii="Georgia" w:cs="Georgia" w:eastAsia="Georgia" w:hAnsi="Georgia"/>
-          <w:b/>
-          <w:bCs/>
-          <w:color w:val="1A1A1A"/>
-          <w:sz w:val="21"/>
-          <w:szCs w:val="21"/>
-        </w:rPr>
-        <w:t xml:space="preserve">+50%/yr</w:t>
-      </w:r>
-      <w:r>
-        <w:rPr>
-          <w:rFonts w:ascii="Georgia" w:cs="Georgia" w:eastAsia="Georgia" w:hAnsi="Georgia"/>
-          <w:color w:val="1A1A1A"/>
-          <w:sz w:val="21"/>
-          <w:szCs w:val="21"/>
-        </w:rPr>
-        <w:t xml:space="preserve">; Ireland &gt;22%→~30%. </w:t>
+        <w:t xml:space="preserve">Your turf — energy, utilities, health (policy lens)</w:t>
+      </w:r>
+    </w:p>
+    <w:p>
+      <w:pPr>
+        <w:pStyle w:val="ListParagraph"/>
+        <w:numPr>
+          <w:ilvl w:val="0"/>
+          <w:numId w:val="1"/>
+        </w:numPr>
+        <w:spacing w:after="70" w:line="268"/>
+      </w:pPr>
+      <w:r>
+        <w:rPr>
+          <w:rFonts w:ascii="Georgia" w:cs="Georgia" w:eastAsia="Georgia" w:hAnsi="Georgia"/>
+          <w:b/>
+          <w:bCs/>
+          <w:color w:val="1A1A1A"/>
+          <w:sz w:val="21"/>
+          <w:szCs w:val="21"/>
+        </w:rPr>
+        <w:t xml:space="preserve">Why policy is your edge:</w:t>
+      </w:r>
+      <w:r>
+        <w:rPr>
+          <w:rFonts w:ascii="Georgia" w:cs="Georgia" w:eastAsia="Georgia" w:hAnsi="Georgia"/>
+          <w:color w:val="1A1A1A"/>
+          <w:sz w:val="21"/>
+          <w:szCs w:val="21"/>
+        </w:rPr>
+        <w:t xml:space="preserve"> her showcase wins are easy in software, hard in regulated/public-interest sectors — where procurement, standards, trust and market design gate adoption. That’s your domain. It </w:t>
       </w:r>
       <w:r>
         <w:rPr>
@@ -1171,6 +1131,96 @@
           <w:sz w:val="21"/>
           <w:szCs w:val="21"/>
         </w:rPr>
+        <w:t xml:space="preserve">extends</w:t>
+      </w:r>
+      <w:r>
+        <w:rPr>
+          <w:rFonts w:ascii="Georgia" w:cs="Georgia" w:eastAsia="Georgia" w:hAnsi="Georgia"/>
+          <w:color w:val="1A1A1A"/>
+          <w:sz w:val="21"/>
+          <w:szCs w:val="21"/>
+        </w:rPr>
+        <w:t xml:space="preserve"> her AI-First thesis (‘adoption gap = systems-design failure’) into the terrain where it bites.</w:t>
+      </w:r>
+    </w:p>
+    <w:p>
+      <w:pPr>
+        <w:pStyle w:val="ListParagraph"/>
+        <w:numPr>
+          <w:ilvl w:val="0"/>
+          <w:numId w:val="1"/>
+        </w:numPr>
+        <w:spacing w:after="70" w:line="268"/>
+      </w:pPr>
+      <w:r>
+        <w:rPr>
+          <w:rFonts w:ascii="Georgia" w:cs="Georgia" w:eastAsia="Georgia" w:hAnsi="Georgia"/>
+          <w:b/>
+          <w:bCs/>
+          <w:color w:val="1A1A1A"/>
+          <w:sz w:val="21"/>
+          <w:szCs w:val="21"/>
+        </w:rPr>
+        <w:t xml:space="preserve">AI’s energy dilemma</w:t>
+      </w:r>
+      <w:r>
+        <w:rPr>
+          <w:rFonts w:ascii="Georgia" w:cs="Georgia" w:eastAsia="Georgia" w:hAnsi="Georgia"/>
+          <w:color w:val="1A1A1A"/>
+          <w:sz w:val="21"/>
+          <w:szCs w:val="21"/>
+        </w:rPr>
+        <w:t xml:space="preserve"> (her Jan-2025 article): data centres ~</w:t>
+      </w:r>
+      <w:r>
+        <w:rPr>
+          <w:rFonts w:ascii="Georgia" w:cs="Georgia" w:eastAsia="Georgia" w:hAnsi="Georgia"/>
+          <w:b/>
+          <w:bCs/>
+          <w:color w:val="1A1A1A"/>
+          <w:sz w:val="21"/>
+          <w:szCs w:val="21"/>
+        </w:rPr>
+        <w:t xml:space="preserve">415→945 TWh by 2030</w:t>
+      </w:r>
+      <w:r>
+        <w:rPr>
+          <w:rFonts w:ascii="Georgia" w:cs="Georgia" w:eastAsia="Georgia" w:hAnsi="Georgia"/>
+          <w:color w:val="1A1A1A"/>
+          <w:sz w:val="21"/>
+          <w:szCs w:val="21"/>
+        </w:rPr>
+        <w:t xml:space="preserve"> (1%→3%+); AI power up to </w:t>
+      </w:r>
+      <w:r>
+        <w:rPr>
+          <w:rFonts w:ascii="Georgia" w:cs="Georgia" w:eastAsia="Georgia" w:hAnsi="Georgia"/>
+          <w:b/>
+          <w:bCs/>
+          <w:color w:val="1A1A1A"/>
+          <w:sz w:val="21"/>
+          <w:szCs w:val="21"/>
+        </w:rPr>
+        <w:t xml:space="preserve">+50%/yr</w:t>
+      </w:r>
+      <w:r>
+        <w:rPr>
+          <w:rFonts w:ascii="Georgia" w:cs="Georgia" w:eastAsia="Georgia" w:hAnsi="Georgia"/>
+          <w:color w:val="1A1A1A"/>
+          <w:sz w:val="21"/>
+          <w:szCs w:val="21"/>
+        </w:rPr>
+        <w:t xml:space="preserve">; Ireland &gt;22%→~30%. </w:t>
+      </w:r>
+      <w:r>
+        <w:rPr>
+          <w:rFonts w:ascii="Georgia" w:cs="Georgia" w:eastAsia="Georgia" w:hAnsi="Georgia"/>
+          <w:i/>
+          <w:iCs/>
+          <w:color w:val="1A1A1A"/>
+          <w:sz w:val="21"/>
+          <w:szCs w:val="21"/>
+        </w:rPr>
         <w:t xml:space="preserve">And</w:t>
       </w:r>
       <w:r>
@@ -1200,7 +1250,7 @@
           <w:sz w:val="21"/>
           <w:szCs w:val="21"/>
         </w:rPr>
-        <w:t xml:space="preserve"> (storage, grid). Goal: </w:t>
+        <w:t xml:space="preserve"> + grid resilience, demand forecasting, DER, outage prediction. Goal: </w:t>
       </w:r>
       <w:r>
         <w:rPr>
@@ -1232,46 +1282,16 @@
           <w:sz w:val="21"/>
           <w:szCs w:val="21"/>
         </w:rPr>
-        <w:t xml:space="preserve">Industrial AI</w:t>
-      </w:r>
-      <w:r>
-        <w:rPr>
-          <w:rFonts w:ascii="Georgia" w:cs="Georgia" w:eastAsia="Georgia" w:hAnsi="Georgia"/>
-          <w:color w:val="1A1A1A"/>
-          <w:sz w:val="21"/>
-          <w:szCs w:val="21"/>
-        </w:rPr>
-        <w:t xml:space="preserve"> = where operations redesign is hardest and most physical (her Advanced Manufacturing roots): predictive maintenance, quality, supply chain, digital twins, agentic ops.</w:t>
-      </w:r>
-    </w:p>
-    <w:p>
-      <w:pPr>
-        <w:pStyle w:val="ListParagraph"/>
-        <w:numPr>
-          <w:ilvl w:val="0"/>
-          <w:numId w:val="1"/>
-        </w:numPr>
-        <w:spacing w:after="70" w:line="268"/>
-      </w:pPr>
-      <w:r>
-        <w:rPr>
-          <w:rFonts w:ascii="Georgia" w:cs="Georgia" w:eastAsia="Georgia" w:hAnsi="Georgia"/>
-          <w:b/>
-          <w:bCs/>
-          <w:color w:val="1A1A1A"/>
-          <w:sz w:val="21"/>
-          <w:szCs w:val="21"/>
-        </w:rPr>
-        <w:t xml:space="preserve">Your synthesis:</w:t>
-      </w:r>
-      <w:r>
-        <w:rPr>
-          <w:rFonts w:ascii="Georgia" w:cs="Georgia" w:eastAsia="Georgia" w:hAnsi="Georgia"/>
-          <w:color w:val="1A1A1A"/>
-          <w:sz w:val="21"/>
-          <w:szCs w:val="21"/>
-        </w:rPr>
-        <w:t xml:space="preserve"> you understand AI adoption where stakes are physical, capital-intensive, systemic — the real economy, not the demo.</w:t>
+        <w:t xml:space="preserve">Health</w:t>
+      </w:r>
+      <w:r>
+        <w:rPr>
+          <w:rFonts w:ascii="Georgia" w:cs="Georgia" w:eastAsia="Georgia" w:hAnsi="Georgia"/>
+          <w:color w:val="1A1A1A"/>
+          <w:sz w:val="21"/>
+          <w:szCs w:val="21"/>
+        </w:rPr>
+        <w:t xml:space="preserve"> = MINDS heartland (Saudi MoH foot-screening: −90% time, −80% cost). Gated by trust, validation, reimbursement — your levers.</w:t>
       </w:r>
     </w:p>
     <w:p>
@@ -1288,121 +1308,141 @@
           <w:sz w:val="22"/>
           <w:szCs w:val="22"/>
         </w:rPr>
-        <w:t xml:space="preserve">Your best questions (pick 6–8)</w:t>
-      </w:r>
-    </w:p>
-    <w:p>
-      <w:pPr>
-        <w:pStyle w:val="ListParagraph"/>
-        <w:numPr>
-          <w:ilvl w:val="0"/>
-          <w:numId w:val="1"/>
-        </w:numPr>
-        <w:spacing w:after="70" w:line="268"/>
-      </w:pPr>
-      <w:r>
-        <w:rPr>
-          <w:rFonts w:ascii="Georgia" w:cs="Georgia" w:eastAsia="Georgia" w:hAnsi="Georgia"/>
-          <w:color w:val="1A1A1A"/>
-          <w:sz w:val="21"/>
-          <w:szCs w:val="21"/>
-        </w:rPr>
-        <w:t xml:space="preserve">Where does the evidence-to-pattern engine (MINDS → AI-First) go next — the gap you most want to close?</w:t>
-      </w:r>
-    </w:p>
-    <w:p>
-      <w:pPr>
-        <w:pStyle w:val="ListParagraph"/>
-        <w:numPr>
-          <w:ilvl w:val="0"/>
-          <w:numId w:val="1"/>
-        </w:numPr>
-        <w:spacing w:after="70" w:line="268"/>
-      </w:pPr>
-      <w:r>
-        <w:rPr>
-          <w:rFonts w:ascii="Georgia" w:cs="Georgia" w:eastAsia="Georgia" w:hAnsi="Georgia"/>
-          <w:color w:val="1A1A1A"/>
-          <w:sz w:val="21"/>
-          <w:szCs w:val="21"/>
-        </w:rPr>
-        <w:t xml:space="preserve">Which of the five building blocks do firms most underestimate — my bet is operations redesign?</w:t>
-      </w:r>
-    </w:p>
-    <w:p>
-      <w:pPr>
-        <w:pStyle w:val="ListParagraph"/>
-        <w:numPr>
-          <w:ilvl w:val="0"/>
-          <w:numId w:val="1"/>
-        </w:numPr>
-        <w:spacing w:after="70" w:line="268"/>
-      </w:pPr>
-      <w:r>
-        <w:rPr>
-          <w:rFonts w:ascii="Georgia" w:cs="Georgia" w:eastAsia="Georgia" w:hAnsi="Georgia"/>
-          <w:color w:val="1A1A1A"/>
-          <w:sz w:val="21"/>
-          <w:szCs w:val="21"/>
-        </w:rPr>
-        <w:t xml:space="preserve">Replicability is the hardest MINDS criterion when the constraint is data/capital, not the model — how do you pick what transfers?</w:t>
-      </w:r>
-    </w:p>
-    <w:p>
-      <w:pPr>
-        <w:pStyle w:val="ListParagraph"/>
-        <w:numPr>
-          <w:ilvl w:val="0"/>
-          <w:numId w:val="1"/>
-        </w:numPr>
-        <w:spacing w:after="70" w:line="268"/>
-      </w:pPr>
-      <w:r>
-        <w:rPr>
-          <w:rFonts w:ascii="Georgia" w:cs="Georgia" w:eastAsia="Georgia" w:hAnsi="Georgia"/>
-          <w:color w:val="1A1A1A"/>
-          <w:sz w:val="21"/>
-          <w:szCs w:val="21"/>
-        </w:rPr>
-        <w:t xml:space="preserve">Does AI net positive for the energy system this decade — technology question or market-design question?</w:t>
-      </w:r>
-    </w:p>
-    <w:p>
-      <w:pPr>
-        <w:pStyle w:val="ListParagraph"/>
-        <w:numPr>
-          <w:ilvl w:val="0"/>
-          <w:numId w:val="1"/>
-        </w:numPr>
-        <w:spacing w:after="70" w:line="268"/>
-      </w:pPr>
-      <w:r>
-        <w:rPr>
-          <w:rFonts w:ascii="Georgia" w:cs="Georgia" w:eastAsia="Georgia" w:hAnsi="Georgia"/>
-          <w:color w:val="1A1A1A"/>
-          <w:sz w:val="21"/>
-          <w:szCs w:val="21"/>
-        </w:rPr>
-        <w:t xml:space="preserve">Industrial AI vs software: does it register in MINDS the way flashy demos do — and should it?</w:t>
-      </w:r>
-    </w:p>
-    <w:p>
-      <w:pPr>
-        <w:pStyle w:val="ListParagraph"/>
-        <w:numPr>
-          <w:ilvl w:val="0"/>
-          <w:numId w:val="1"/>
-        </w:numPr>
-        <w:spacing w:after="70" w:line="268"/>
-      </w:pPr>
-      <w:r>
-        <w:rPr>
-          <w:rFonts w:ascii="Georgia" w:cs="Georgia" w:eastAsia="Georgia" w:hAnsi="Georgia"/>
-          <w:color w:val="1A1A1A"/>
-          <w:sz w:val="21"/>
-          <w:szCs w:val="21"/>
-        </w:rPr>
-        <w:t xml:space="preserve">If you were bringing someone into this work, where’s the most value now — generating evidence, curating the ecosystem, or codifying patterns?</w:t>
+        <w:t xml:space="preserve">Your best openers — offer a view, then ask (pick 5–6)</w:t>
+      </w:r>
+    </w:p>
+    <w:p>
+      <w:pPr>
+        <w:pStyle w:val="ListParagraph"/>
+        <w:numPr>
+          <w:ilvl w:val="0"/>
+          <w:numId w:val="1"/>
+        </w:numPr>
+        <w:spacing w:after="70" w:line="268"/>
+      </w:pPr>
+      <w:r>
+        <w:rPr>
+          <w:rFonts w:ascii="Georgia" w:cs="Georgia" w:eastAsia="Georgia" w:hAnsi="Georgia"/>
+          <w:color w:val="1A1A1A"/>
+          <w:sz w:val="21"/>
+          <w:szCs w:val="21"/>
+        </w:rPr>
+        <w:t xml:space="preserve">MINDS + AI-First are one loop (find proof → codify pattern) — where’s it hardest now, finding proof or getting the pattern adopted?</w:t>
+      </w:r>
+    </w:p>
+    <w:p>
+      <w:pPr>
+        <w:pStyle w:val="ListParagraph"/>
+        <w:numPr>
+          <w:ilvl w:val="0"/>
+          <w:numId w:val="1"/>
+        </w:numPr>
+        <w:spacing w:after="70" w:line="268"/>
+      </w:pPr>
+      <w:r>
+        <w:rPr>
+          <w:rFonts w:ascii="Georgia" w:cs="Georgia" w:eastAsia="Georgia" w:hAnsi="Georgia"/>
+          <w:color w:val="1A1A1A"/>
+          <w:sz w:val="21"/>
+          <w:szCs w:val="21"/>
+        </w:rPr>
+        <w:t xml:space="preserve">From the policy side, adoption in regulated sectors stalls on the enabling environment as much as the tech — how much of MINDS is really about the conditions around the deployment?</w:t>
+      </w:r>
+    </w:p>
+    <w:p>
+      <w:pPr>
+        <w:pStyle w:val="ListParagraph"/>
+        <w:numPr>
+          <w:ilvl w:val="0"/>
+          <w:numId w:val="1"/>
+        </w:numPr>
+        <w:spacing w:after="70" w:line="268"/>
+      </w:pPr>
+      <w:r>
+        <w:rPr>
+          <w:rFonts w:ascii="Georgia" w:cs="Georgia" w:eastAsia="Georgia" w:hAnsi="Georgia"/>
+          <w:color w:val="1A1A1A"/>
+          <w:sz w:val="21"/>
+          <w:szCs w:val="21"/>
+        </w:rPr>
+        <w:t xml:space="preserve">Your energy-dilemma piece resonated — in climate-resilient energy/utilities AI is load </w:t>
+      </w:r>
+      <w:r>
+        <w:rPr>
+          <w:rFonts w:ascii="Georgia" w:cs="Georgia" w:eastAsia="Georgia" w:hAnsi="Georgia"/>
+          <w:i/>
+          <w:iCs/>
+          <w:color w:val="1A1A1A"/>
+          <w:sz w:val="21"/>
+          <w:szCs w:val="21"/>
+        </w:rPr>
+        <w:t xml:space="preserve">and</w:t>
+      </w:r>
+      <w:r>
+        <w:rPr>
+          <w:rFonts w:ascii="Georgia" w:cs="Georgia" w:eastAsia="Georgia" w:hAnsi="Georgia"/>
+          <w:color w:val="1A1A1A"/>
+          <w:sz w:val="21"/>
+          <w:szCs w:val="21"/>
+        </w:rPr>
+        <w:t xml:space="preserve"> resilience tool. Net positive this decade — technology, or market-design-and-policy?</w:t>
+      </w:r>
+    </w:p>
+    <w:p>
+      <w:pPr>
+        <w:pStyle w:val="ListParagraph"/>
+        <w:numPr>
+          <w:ilvl w:val="0"/>
+          <w:numId w:val="1"/>
+        </w:numPr>
+        <w:spacing w:after="70" w:line="268"/>
+      </w:pPr>
+      <w:r>
+        <w:rPr>
+          <w:rFonts w:ascii="Georgia" w:cs="Georgia" w:eastAsia="Georgia" w:hAnsi="Georgia"/>
+          <w:color w:val="1A1A1A"/>
+          <w:sz w:val="21"/>
+          <w:szCs w:val="21"/>
+        </w:rPr>
+        <w:t xml:space="preserve">Utilities are a stress test for AI-First — regulated, safety-critical, slow. Are you seeing the operating-model redesign there, or mostly fast software firms?</w:t>
+      </w:r>
+    </w:p>
+    <w:p>
+      <w:pPr>
+        <w:pStyle w:val="ListParagraph"/>
+        <w:numPr>
+          <w:ilvl w:val="0"/>
+          <w:numId w:val="1"/>
+        </w:numPr>
+        <w:spacing w:after="70" w:line="268"/>
+      </w:pPr>
+      <w:r>
+        <w:rPr>
+          <w:rFonts w:ascii="Georgia" w:cs="Georgia" w:eastAsia="Georgia" w:hAnsi="Georgia"/>
+          <w:color w:val="1A1A1A"/>
+          <w:sz w:val="21"/>
+          <w:szCs w:val="21"/>
+        </w:rPr>
+        <w:t xml:space="preserve">Health cases stay with me — trust and reimbursement decide if a model reaches a patient. Push MINDS deeper into public-interest sectors, or is the pull enterprise?</w:t>
+      </w:r>
+    </w:p>
+    <w:p>
+      <w:pPr>
+        <w:pStyle w:val="ListParagraph"/>
+        <w:numPr>
+          <w:ilvl w:val="0"/>
+          <w:numId w:val="1"/>
+        </w:numPr>
+        <w:spacing w:after="70" w:line="268"/>
+      </w:pPr>
+      <w:r>
+        <w:rPr>
+          <w:rFonts w:ascii="Georgia" w:cs="Georgia" w:eastAsia="Georgia" w:hAnsi="Georgia"/>
+          <w:color w:val="1A1A1A"/>
+          <w:sz w:val="21"/>
+          <w:szCs w:val="21"/>
+        </w:rPr>
+        <w:t xml:space="preserve">If someone came at this from the policy / enabling-environment side (energy, utilities, health), where would they add most — and where earn their stripes?</w:t>
       </w:r>
     </w:p>
     <w:p>
@@ -1449,37 +1489,37 @@
           <w:sz w:val="21"/>
           <w:szCs w:val="21"/>
         </w:rPr>
-        <w:t xml:space="preserve"> → real-economy throughline → pattern (deploy tech, move a number) → why her work now. End on a hook.</w:t>
-      </w:r>
-    </w:p>
-    <w:p>
-      <w:pPr>
-        <w:pStyle w:val="ListParagraph"/>
-        <w:numPr>
-          <w:ilvl w:val="0"/>
-          <w:numId w:val="1"/>
-        </w:numPr>
-        <w:spacing w:after="70" w:line="268"/>
-      </w:pPr>
-      <w:r>
-        <w:rPr>
-          <w:rFonts w:ascii="Georgia" w:cs="Georgia" w:eastAsia="Georgia" w:hAnsi="Georgia"/>
-          <w:b/>
-          <w:bCs/>
-          <w:color w:val="1A1A1A"/>
-          <w:sz w:val="21"/>
-          <w:szCs w:val="21"/>
-        </w:rPr>
-        <w:t xml:space="preserve">“You’re not from AI — why add value?”</w:t>
-      </w:r>
-      <w:r>
-        <w:rPr>
-          <w:rFonts w:ascii="Georgia" w:cs="Georgia" w:eastAsia="Georgia" w:hAnsi="Georgia"/>
-          <w:color w:val="1A1A1A"/>
-          <w:sz w:val="21"/>
-          <w:szCs w:val="21"/>
-        </w:rPr>
-        <w:t xml:space="preserve"> → models aren’t the bottleneck, the operating model is; that’s an industrial-transformation problem = your home ground.</w:t>
+        <w:t xml:space="preserve"> → policy in energy/utilities/health → pattern (make tech adoptable where the enabling environment is the constraint) → why her work now. End on a hook.</w:t>
+      </w:r>
+    </w:p>
+    <w:p>
+      <w:pPr>
+        <w:pStyle w:val="ListParagraph"/>
+        <w:numPr>
+          <w:ilvl w:val="0"/>
+          <w:numId w:val="1"/>
+        </w:numPr>
+        <w:spacing w:after="70" w:line="268"/>
+      </w:pPr>
+      <w:r>
+        <w:rPr>
+          <w:rFonts w:ascii="Georgia" w:cs="Georgia" w:eastAsia="Georgia" w:hAnsi="Georgia"/>
+          <w:b/>
+          <w:bCs/>
+          <w:color w:val="1A1A1A"/>
+          <w:sz w:val="21"/>
+          <w:szCs w:val="21"/>
+        </w:rPr>
+        <w:t xml:space="preserve">“You’re policy, not AI — why add value?”</w:t>
+      </w:r>
+      <w:r>
+        <w:rPr>
+          <w:rFonts w:ascii="Georgia" w:cs="Georgia" w:eastAsia="Georgia" w:hAnsi="Georgia"/>
+          <w:color w:val="1A1A1A"/>
+          <w:sz w:val="21"/>
+          <w:szCs w:val="21"/>
+        </w:rPr>
+        <w:t xml:space="preserve"> → in regulated sectors the model isn’t the bottleneck, the enabling environment is; that’s your home ground.</w:t>
       </w:r>
     </w:p>
     <w:p>
@@ -1509,7 +1549,7 @@
           <w:sz w:val="21"/>
           <w:szCs w:val="21"/>
         </w:rPr>
-        <w:t xml:space="preserve"> → one specific, humble hypothesis tied to her portfolio; happy to be redirected.</w:t>
+        <w:t xml:space="preserve"> → one specific, humble hypothesis: deepen MINDS/AI-First in energy/utilities/health, or the enabling-environment playbook for regulated sectors.</w:t>
       </w:r>
     </w:p>
     <w:p>
@@ -1539,7 +1579,7 @@
           <w:sz w:val="21"/>
           <w:szCs w:val="21"/>
         </w:rPr>
-        <w:t xml:space="preserve"> → better models don’t solve adoption; workflow/data/operating-model redesign does. Judgement, not cynicism.</w:t>
+        <w:t xml:space="preserve"> → better models don’t solve adoption; trust, procurement, validation and market design do. Judgement, not cynicism.</w:t>
       </w:r>
     </w:p>
     <w:p>
@@ -1575,83 +1615,83 @@
           <w:sz w:val="21"/>
           <w:szCs w:val="21"/>
         </w:rPr>
-        <w:t xml:space="preserve">“The interesting failure mode isn’t bad models — it’s good models in unchanged workflows.”</w:t>
-      </w:r>
-    </w:p>
-    <w:p>
-      <w:pPr>
-        <w:pStyle w:val="ListParagraph"/>
-        <w:numPr>
-          <w:ilvl w:val="0"/>
-          <w:numId w:val="1"/>
-        </w:numPr>
-        <w:spacing w:after="70" w:line="268"/>
-      </w:pPr>
-      <w:r>
-        <w:rPr>
-          <w:rFonts w:ascii="Georgia" w:cs="Georgia" w:eastAsia="Georgia" w:hAnsi="Georgia"/>
-          <w:color w:val="1A1A1A"/>
-          <w:sz w:val="21"/>
-          <w:szCs w:val="21"/>
-        </w:rPr>
-        <w:t xml:space="preserve">“MINDS quietly proves adoption is an operating-model problem, not a model problem — which is why the AI-First blueprint had to exist.”</w:t>
-      </w:r>
-    </w:p>
-    <w:p>
-      <w:pPr>
-        <w:pStyle w:val="ListParagraph"/>
-        <w:numPr>
-          <w:ilvl w:val="0"/>
-          <w:numId w:val="1"/>
-        </w:numPr>
-        <w:spacing w:after="70" w:line="268"/>
-      </w:pPr>
-      <w:r>
-        <w:rPr>
-          <w:rFonts w:ascii="Georgia" w:cs="Georgia" w:eastAsia="Georgia" w:hAnsi="Georgia"/>
-          <w:color w:val="1A1A1A"/>
-          <w:sz w:val="21"/>
-          <w:szCs w:val="21"/>
-        </w:rPr>
-        <w:t xml:space="preserve">“I’ve always worked where the technology has to survive contact with reality — a grid, a factory, a supply chain.”</w:t>
-      </w:r>
-    </w:p>
-    <w:p>
-      <w:pPr>
-        <w:pStyle w:val="ListParagraph"/>
-        <w:numPr>
-          <w:ilvl w:val="0"/>
-          <w:numId w:val="1"/>
-        </w:numPr>
-        <w:spacing w:after="70" w:line="268"/>
-      </w:pPr>
-      <w:r>
-        <w:rPr>
-          <w:rFonts w:ascii="Georgia" w:cs="Georgia" w:eastAsia="Georgia" w:hAnsi="Georgia"/>
-          <w:color w:val="1A1A1A"/>
-          <w:sz w:val="21"/>
-          <w:szCs w:val="21"/>
-        </w:rPr>
-        <w:t xml:space="preserve">“The AI-energy story is usually told as a threat; it’s really a systems question — biggest new load and one of the best optimisation tools at once.”</w:t>
-      </w:r>
-    </w:p>
-    <w:p>
-      <w:pPr>
-        <w:pStyle w:val="ListParagraph"/>
-        <w:numPr>
-          <w:ilvl w:val="0"/>
-          <w:numId w:val="1"/>
-        </w:numPr>
-        <w:spacing w:after="70" w:line="268"/>
-      </w:pPr>
-      <w:r>
-        <w:rPr>
-          <w:rFonts w:ascii="Georgia" w:cs="Georgia" w:eastAsia="Georgia" w:hAnsi="Georgia"/>
-          <w:color w:val="1A1A1A"/>
-          <w:sz w:val="21"/>
-          <w:szCs w:val="21"/>
-        </w:rPr>
-        <w:t xml:space="preserve">“Intelligence as capital means the hard part is allocation — every function wants AI at once.”</w:t>
+        <w:t xml:space="preserve">“In my sectors the model is rarely the bottleneck — the enabling environment is.”</w:t>
+      </w:r>
+    </w:p>
+    <w:p>
+      <w:pPr>
+        <w:pStyle w:val="ListParagraph"/>
+        <w:numPr>
+          <w:ilvl w:val="0"/>
+          <w:numId w:val="1"/>
+        </w:numPr>
+        <w:spacing w:after="70" w:line="268"/>
+      </w:pPr>
+      <w:r>
+        <w:rPr>
+          <w:rFonts w:ascii="Georgia" w:cs="Georgia" w:eastAsia="Georgia" w:hAnsi="Georgia"/>
+          <w:color w:val="1A1A1A"/>
+          <w:sz w:val="21"/>
+          <w:szCs w:val="21"/>
+        </w:rPr>
+        <w:t xml:space="preserve">“MINDS quietly proves adoption is a systems-and-conditions problem, not a model problem — which is why the AI-First blueprint had to exist.”</w:t>
+      </w:r>
+    </w:p>
+    <w:p>
+      <w:pPr>
+        <w:pStyle w:val="ListParagraph"/>
+        <w:numPr>
+          <w:ilvl w:val="0"/>
+          <w:numId w:val="1"/>
+        </w:numPr>
+        <w:spacing w:after="70" w:line="268"/>
+      </w:pPr>
+      <w:r>
+        <w:rPr>
+          <w:rFonts w:ascii="Georgia" w:cs="Georgia" w:eastAsia="Georgia" w:hAnsi="Georgia"/>
+          <w:color w:val="1A1A1A"/>
+          <w:sz w:val="21"/>
+          <w:szCs w:val="21"/>
+        </w:rPr>
+        <w:t xml:space="preserve">“The same AI that strains the grid is our best tool for grid resilience — whether it nets positive is a market-design and policy question.”</w:t>
+      </w:r>
+    </w:p>
+    <w:p>
+      <w:pPr>
+        <w:pStyle w:val="ListParagraph"/>
+        <w:numPr>
+          <w:ilvl w:val="0"/>
+          <w:numId w:val="1"/>
+        </w:numPr>
+        <w:spacing w:after="70" w:line="268"/>
+      </w:pPr>
+      <w:r>
+        <w:rPr>
+          <w:rFonts w:ascii="Georgia" w:cs="Georgia" w:eastAsia="Georgia" w:hAnsi="Georgia"/>
+          <w:color w:val="1A1A1A"/>
+          <w:sz w:val="21"/>
+          <w:szCs w:val="21"/>
+        </w:rPr>
+        <w:t xml:space="preserve">“In regulated sectors what actually transfers isn’t the model — it’s the policy and procurement scaffolding around it.”</w:t>
+      </w:r>
+    </w:p>
+    <w:p>
+      <w:pPr>
+        <w:pStyle w:val="ListParagraph"/>
+        <w:numPr>
+          <w:ilvl w:val="0"/>
+          <w:numId w:val="1"/>
+        </w:numPr>
+        <w:spacing w:after="70" w:line="268"/>
+      </w:pPr>
+      <w:r>
+        <w:rPr>
+          <w:rFonts w:ascii="Georgia" w:cs="Georgia" w:eastAsia="Georgia" w:hAnsi="Georgia"/>
+          <w:color w:val="1A1A1A"/>
+          <w:sz w:val="21"/>
+          <w:szCs w:val="21"/>
+        </w:rPr>
+        <w:t xml:space="preserve">“The hype skips the boring, decisive middle — trust and procurement — which is where adoption is actually won or lost.”</w:t>
       </w:r>
     </w:p>
     <w:p>
@@ -1698,7 +1738,7 @@
           <w:sz w:val="21"/>
           <w:szCs w:val="21"/>
         </w:rPr>
-        <w:t xml:space="preserve"> bring one artefact of thought · name an honest tension in her model · mirror her language (proof over promise, operating model, deployment, systems).</w:t>
+        <w:t xml:space="preserve"> offer a view then ask (never quiz) · bring one artefact of thought from energy/utilities/health · name an honest tension in her model · mirror her language (proof over promise, operating model, deployment, responsible, systems).</w:t>
       </w:r>
     </w:p>
     <w:p>
@@ -1728,7 +1768,7 @@
           <w:sz w:val="21"/>
           <w:szCs w:val="21"/>
         </w:rPr>
-        <w:t xml:space="preserve"> buzzword bingo · ask her to explain the Forum · turn it into a job ask too early. Make the one explicit ask late and light, then follow up in 48 hours.</w:t>
+        <w:t xml:space="preserve"> buzzword bingo · apologise for being ‘just policy’ (it’s your edge) · ask her to explain the Forum · turn it into a job ask too early. Make the one ask late and light, then follow up in 48 hours.</w:t>
       </w:r>
     </w:p>
     <w:p>
@@ -1786,7 +1826,7 @@
                 <w:sz w:val="20"/>
                 <w:szCs w:val="20"/>
               </w:rPr>
-              <w:t xml:space="preserve">Can I (1) say my one-breath pitch; (2) name Maria’s two initiatives and the link between them; (3) spell out MINDS and its 3 criteria; (4) list the 5 building blocks; (5) quote the $250bn/25% gap and one MINDS proof point; (6) speak both sides of AI’s energy dilemma; (7) ask 6 sharp questions and answer her four back? If yes to all seven, I’m ready.</w:t>
+              <w:t xml:space="preserve">Can I (1) say my one-breath policy pitch; (2) name Maria’s two initiatives and the link between them; (3) spell out MINDS and its 3 criteria; (4) list the 5 building blocks; (5) quote the $250bn/25% gap and one MINDS proof point; (6) speak both sides of AI’s energy dilemma; (7) open 5 questions with a view-then-ask, and answer her four back? If yes to all seven, I’m ready.</w:t>
             </w:r>
           </w:p>
         </w:tc>

</xml_diff>